<commit_message>
feat: add professional experience details and create React-based portfolio application
</commit_message>
<xml_diff>
--- a/Lakshya_Kumar_CV.docx
+++ b/Lakshya_Kumar_CV.docx
@@ -61,6 +61,7 @@
         </w:rPr>
         <w:t xml:space="preserve"> | GitHub: github.com/</w:t>
       </w:r>
+      <w:proofErr w:type="spellStart"/>
       <w:r>
         <w:rPr>
           <w:rFonts w:ascii="Helvetica" w:hAnsi="Helvetica" w:cs="Helvetica"/>
@@ -68,6 +69,7 @@
         </w:rPr>
         <w:t>lakshyakumar</w:t>
       </w:r>
+      <w:proofErr w:type="spellEnd"/>
     </w:p>
     <w:p>
       <w:pPr>
@@ -135,8 +137,49 @@
           <w:rFonts w:ascii="Helvetica" w:hAnsi="Helvetica" w:cs="Helvetica"/>
           <w:sz w:val="21"/>
         </w:rPr>
-        <w:t xml:space="preserve"> Node.js, React, Next.js, REST APIs, Microservices, LangChain, LangGraph, CrewAI, PydanticAI</w:t>
-      </w:r>
+        <w:t xml:space="preserve"> Node.js, React, Next.js, REST APIs, Microservices, </w:t>
+      </w:r>
+      <w:proofErr w:type="spellStart"/>
+      <w:r>
+        <w:rPr>
+          <w:rFonts w:ascii="Helvetica" w:hAnsi="Helvetica" w:cs="Helvetica"/>
+          <w:sz w:val="21"/>
+        </w:rPr>
+        <w:t>LangChain</w:t>
+      </w:r>
+      <w:proofErr w:type="spellEnd"/>
+      <w:r>
+        <w:rPr>
+          <w:rFonts w:ascii="Helvetica" w:hAnsi="Helvetica" w:cs="Helvetica"/>
+          <w:sz w:val="21"/>
+        </w:rPr>
+        <w:t xml:space="preserve">, LangGraph, </w:t>
+      </w:r>
+      <w:proofErr w:type="spellStart"/>
+      <w:r>
+        <w:rPr>
+          <w:rFonts w:ascii="Helvetica" w:hAnsi="Helvetica" w:cs="Helvetica"/>
+          <w:sz w:val="21"/>
+        </w:rPr>
+        <w:t>CrewAI</w:t>
+      </w:r>
+      <w:proofErr w:type="spellEnd"/>
+      <w:r>
+        <w:rPr>
+          <w:rFonts w:ascii="Helvetica" w:hAnsi="Helvetica" w:cs="Helvetica"/>
+          <w:sz w:val="21"/>
+        </w:rPr>
+        <w:t xml:space="preserve">, </w:t>
+      </w:r>
+      <w:proofErr w:type="spellStart"/>
+      <w:r>
+        <w:rPr>
+          <w:rFonts w:ascii="Helvetica" w:hAnsi="Helvetica" w:cs="Helvetica"/>
+          <w:sz w:val="21"/>
+        </w:rPr>
+        <w:t>PydanticAI</w:t>
+      </w:r>
+      <w:proofErr w:type="spellEnd"/>
     </w:p>
     <w:p>
       <w:r>
@@ -186,8 +229,49 @@
           <w:rFonts w:ascii="Helvetica" w:hAnsi="Helvetica" w:cs="Helvetica"/>
           <w:sz w:val="21"/>
         </w:rPr>
-        <w:t xml:space="preserve"> AWS, ECS, EC2, Lambda, S3, ECR, CodeBuild, CodePipeline, Docker, Kubernetes, CI/CD, GitHub Actions, Jenkins, GitOps</w:t>
-      </w:r>
+        <w:t xml:space="preserve"> AWS, ECS, EC2, Lambda, S3, ECR, </w:t>
+      </w:r>
+      <w:proofErr w:type="spellStart"/>
+      <w:r>
+        <w:rPr>
+          <w:rFonts w:ascii="Helvetica" w:hAnsi="Helvetica" w:cs="Helvetica"/>
+          <w:sz w:val="21"/>
+        </w:rPr>
+        <w:t>CodeBuild</w:t>
+      </w:r>
+      <w:proofErr w:type="spellEnd"/>
+      <w:r>
+        <w:rPr>
+          <w:rFonts w:ascii="Helvetica" w:hAnsi="Helvetica" w:cs="Helvetica"/>
+          <w:sz w:val="21"/>
+        </w:rPr>
+        <w:t xml:space="preserve">, </w:t>
+      </w:r>
+      <w:proofErr w:type="spellStart"/>
+      <w:r>
+        <w:rPr>
+          <w:rFonts w:ascii="Helvetica" w:hAnsi="Helvetica" w:cs="Helvetica"/>
+          <w:sz w:val="21"/>
+        </w:rPr>
+        <w:t>CodePipeline</w:t>
+      </w:r>
+      <w:proofErr w:type="spellEnd"/>
+      <w:r>
+        <w:rPr>
+          <w:rFonts w:ascii="Helvetica" w:hAnsi="Helvetica" w:cs="Helvetica"/>
+          <w:sz w:val="21"/>
+        </w:rPr>
+        <w:t xml:space="preserve">, Docker, Kubernetes, CI/CD, GitHub Actions, Jenkins, </w:t>
+      </w:r>
+      <w:proofErr w:type="spellStart"/>
+      <w:r>
+        <w:rPr>
+          <w:rFonts w:ascii="Helvetica" w:hAnsi="Helvetica" w:cs="Helvetica"/>
+          <w:sz w:val="21"/>
+        </w:rPr>
+        <w:t>GitOps</w:t>
+      </w:r>
+      <w:proofErr w:type="spellEnd"/>
     </w:p>
     <w:p>
       <w:r>
@@ -241,8 +325,18 @@
           <w:b/>
           <w:sz w:val="21"/>
         </w:rPr>
-        <w:t>Tech Lead (Contract) | Payram</w:t>
-      </w:r>
+        <w:t xml:space="preserve">Tech Lead (Contract) | </w:t>
+      </w:r>
+      <w:proofErr w:type="spellStart"/>
+      <w:r>
+        <w:rPr>
+          <w:rFonts w:ascii="Helvetica" w:hAnsi="Helvetica" w:cs="Helvetica"/>
+          <w:b/>
+          <w:sz w:val="21"/>
+        </w:rPr>
+        <w:t>Payram</w:t>
+      </w:r>
+      <w:proofErr w:type="spellEnd"/>
       <w:r>
         <w:rPr>
           <w:rFonts w:ascii="Helvetica" w:hAnsi="Helvetica" w:cs="Helvetica"/>
@@ -401,7 +495,23 @@
           <w:sz w:val="21"/>
         </w:rPr>
         <w:tab/>
-        <w:t>Built an enterprise RAG chatbot with Python, LangChain, LangGraph, and Next.js, reducing retrieval time by 60%.</w:t>
+        <w:t xml:space="preserve">Built an enterprise RAG chatbot with Python, </w:t>
+      </w:r>
+      <w:proofErr w:type="spellStart"/>
+      <w:r>
+        <w:rPr>
+          <w:rFonts w:ascii="Helvetica" w:hAnsi="Helvetica" w:cs="Helvetica"/>
+          <w:sz w:val="21"/>
+        </w:rPr>
+        <w:t>LangChain</w:t>
+      </w:r>
+      <w:proofErr w:type="spellEnd"/>
+      <w:r>
+        <w:rPr>
+          <w:rFonts w:ascii="Helvetica" w:hAnsi="Helvetica" w:cs="Helvetica"/>
+          <w:sz w:val="21"/>
+        </w:rPr>
+        <w:t>, LangGraph, and Next.js, reducing retrieval time by 60%.</w:t>
       </w:r>
     </w:p>
     <w:p>
@@ -523,7 +633,93 @@
         <w:t>Built MCP-compatible AI tooling patterns for enterprise knowledge retrieval and developer productivity.</w:t>
       </w:r>
     </w:p>
+    <w:p>
+      <w:pPr>
+        <w:rPr>
+          <w:rFonts w:ascii="Helvetica" w:hAnsi="Helvetica" w:cs="Helvetica"/>
+          <w:sz w:val="21"/>
+        </w:rPr>
+      </w:pPr>
+      <w:r>
+        <w:rPr>
+          <w:rFonts w:ascii="Helvetica" w:hAnsi="Helvetica" w:cs="Helvetica"/>
+          <w:sz w:val="21"/>
+        </w:rPr>
+        <w:t>•</w:t>
+      </w:r>
+      <w:r>
+        <w:rPr>
+          <w:rFonts w:ascii="Helvetica" w:hAnsi="Helvetica" w:cs="Helvetica"/>
+          <w:sz w:val="21"/>
+        </w:rPr>
+        <w:tab/>
+      </w:r>
+      <w:r>
+        <w:rPr>
+          <w:rFonts w:ascii="Helvetica" w:hAnsi="Helvetica" w:cs="Helvetica"/>
+          <w:sz w:val="21"/>
+        </w:rPr>
+        <w:t xml:space="preserve">Managed containerized deployments through AWS code Pipelines, using AWS </w:t>
+      </w:r>
+      <w:proofErr w:type="spellStart"/>
+      <w:r>
+        <w:rPr>
+          <w:rFonts w:ascii="Helvetica" w:hAnsi="Helvetica" w:cs="Helvetica"/>
+          <w:sz w:val="21"/>
+        </w:rPr>
+        <w:t>CodeCommit</w:t>
+      </w:r>
+      <w:proofErr w:type="spellEnd"/>
+      <w:r>
+        <w:rPr>
+          <w:rFonts w:ascii="Helvetica" w:hAnsi="Helvetica" w:cs="Helvetica"/>
+          <w:sz w:val="21"/>
+        </w:rPr>
+        <w:t xml:space="preserve">, </w:t>
+      </w:r>
+      <w:proofErr w:type="spellStart"/>
+      <w:r>
+        <w:rPr>
+          <w:rFonts w:ascii="Helvetica" w:hAnsi="Helvetica" w:cs="Helvetica"/>
+          <w:sz w:val="21"/>
+        </w:rPr>
+        <w:t>Github</w:t>
+      </w:r>
+      <w:proofErr w:type="spellEnd"/>
+      <w:r>
+        <w:rPr>
+          <w:rFonts w:ascii="Helvetica" w:hAnsi="Helvetica" w:cs="Helvetica"/>
+          <w:sz w:val="21"/>
+        </w:rPr>
+        <w:t xml:space="preserve"> Actions, ECR, ECS, and created the infrastructure using Terraform and </w:t>
+      </w:r>
+      <w:proofErr w:type="spellStart"/>
+      <w:r>
+        <w:rPr>
+          <w:rFonts w:ascii="Helvetica" w:hAnsi="Helvetica" w:cs="Helvetica"/>
+          <w:sz w:val="21"/>
+        </w:rPr>
+        <w:t>cloudFormation</w:t>
+      </w:r>
+      <w:proofErr w:type="spellEnd"/>
+      <w:r>
+        <w:rPr>
+          <w:rFonts w:ascii="Helvetica" w:hAnsi="Helvetica" w:cs="Helvetica"/>
+          <w:sz w:val="21"/>
+        </w:rPr>
+        <w:t>.</w:t>
+      </w:r>
+    </w:p>
+    <w:p>
+      <w:pPr>
+        <w:rPr>
+          <w:rFonts w:ascii="Helvetica" w:hAnsi="Helvetica" w:cs="Helvetica"/>
+          <w:sz w:val="21"/>
+        </w:rPr>
+      </w:pPr>
+    </w:p>
     <w:p/>
+    <w:p/>
     <w:p>
       <w:r>
         <w:rPr>
@@ -725,7 +921,39 @@
           <w:sz w:val="21"/>
         </w:rPr>
         <w:tab/>
-        <w:t>Designed tokenomics and NFT-based incentive systems for the eQUAD token.</w:t>
+        <w:t xml:space="preserve">Designed </w:t>
+      </w:r>
+      <w:proofErr w:type="spellStart"/>
+      <w:r>
+        <w:rPr>
+          <w:rFonts w:ascii="Helvetica" w:hAnsi="Helvetica" w:cs="Helvetica"/>
+          <w:sz w:val="21"/>
+        </w:rPr>
+        <w:t>tokenomics</w:t>
+      </w:r>
+      <w:proofErr w:type="spellEnd"/>
+      <w:r>
+        <w:rPr>
+          <w:rFonts w:ascii="Helvetica" w:hAnsi="Helvetica" w:cs="Helvetica"/>
+          <w:sz w:val="21"/>
+        </w:rPr>
+        <w:t xml:space="preserve"> and NFT-based incentive systems for the </w:t>
+      </w:r>
+      <w:proofErr w:type="spellStart"/>
+      <w:r>
+        <w:rPr>
+          <w:rFonts w:ascii="Helvetica" w:hAnsi="Helvetica" w:cs="Helvetica"/>
+          <w:sz w:val="21"/>
+        </w:rPr>
+        <w:t>eQUAD</w:t>
+      </w:r>
+      <w:proofErr w:type="spellEnd"/>
+      <w:r>
+        <w:rPr>
+          <w:rFonts w:ascii="Helvetica" w:hAnsi="Helvetica" w:cs="Helvetica"/>
+          <w:sz w:val="21"/>
+        </w:rPr>
+        <w:t xml:space="preserve"> token.</w:t>
       </w:r>
     </w:p>
     <w:p>
@@ -751,6 +979,7 @@
           <w:rFonts w:ascii="Helvetica" w:hAnsi="Helvetica" w:cs="Helvetica"/>
           <w:sz w:val="21"/>
         </w:rPr>
+        <w:lastRenderedPageBreak/>
         <w:t>•</w:t>
       </w:r>
       <w:r>
@@ -804,7 +1033,6 @@
           <w:b/>
           <w:sz w:val="21"/>
         </w:rPr>
-        <w:lastRenderedPageBreak/>
         <w:t>Concept Engineer | Everledger</w:t>
       </w:r>
       <w:r>
@@ -982,7 +1210,23 @@
           <w:sz w:val="21"/>
         </w:rPr>
         <w:tab/>
-        <w:t>Implemented CI/CD and GitOps workflows using Jenkins and Travis CI for enterprise blockchain delivery.</w:t>
+        <w:t xml:space="preserve">Implemented CI/CD and </w:t>
+      </w:r>
+      <w:proofErr w:type="spellStart"/>
+      <w:r>
+        <w:rPr>
+          <w:rFonts w:ascii="Helvetica" w:hAnsi="Helvetica" w:cs="Helvetica"/>
+          <w:sz w:val="21"/>
+        </w:rPr>
+        <w:t>GitOps</w:t>
+      </w:r>
+      <w:proofErr w:type="spellEnd"/>
+      <w:r>
+        <w:rPr>
+          <w:rFonts w:ascii="Helvetica" w:hAnsi="Helvetica" w:cs="Helvetica"/>
+          <w:sz w:val="21"/>
+        </w:rPr>
+        <w:t xml:space="preserve"> workflows using Jenkins and Travis CI for enterprise blockchain delivery.</w:t>
       </w:r>
     </w:p>
     <w:p>
@@ -1078,7 +1322,23 @@
           <w:rFonts w:ascii="Helvetica" w:hAnsi="Helvetica" w:cs="Helvetica"/>
           <w:sz w:val="21"/>
         </w:rPr>
-        <w:t xml:space="preserve"> Built a production AI assistant for document question answering using LangChain and LangGraph.</w:t>
+        <w:t xml:space="preserve"> Built a production AI assistant for document question answering using </w:t>
+      </w:r>
+      <w:proofErr w:type="spellStart"/>
+      <w:r>
+        <w:rPr>
+          <w:rFonts w:ascii="Helvetica" w:hAnsi="Helvetica" w:cs="Helvetica"/>
+          <w:sz w:val="21"/>
+        </w:rPr>
+        <w:t>LangChain</w:t>
+      </w:r>
+      <w:proofErr w:type="spellEnd"/>
+      <w:r>
+        <w:rPr>
+          <w:rFonts w:ascii="Helvetica" w:hAnsi="Helvetica" w:cs="Helvetica"/>
+          <w:sz w:val="21"/>
+        </w:rPr>
+        <w:t xml:space="preserve"> and LangGraph.</w:t>
       </w:r>
     </w:p>
     <w:p>
@@ -1112,7 +1372,39 @@
           <w:rFonts w:ascii="Helvetica" w:hAnsi="Helvetica" w:cs="Helvetica"/>
           <w:sz w:val="21"/>
         </w:rPr>
-        <w:t xml:space="preserve"> Created developer tooling including Turbulent, Enthalpy, XlToDb, and Wallact.</w:t>
+        <w:t xml:space="preserve"> Created developer tooling including Turbulent, Enthalpy, </w:t>
+      </w:r>
+      <w:proofErr w:type="spellStart"/>
+      <w:r>
+        <w:rPr>
+          <w:rFonts w:ascii="Helvetica" w:hAnsi="Helvetica" w:cs="Helvetica"/>
+          <w:sz w:val="21"/>
+        </w:rPr>
+        <w:t>XlToDb</w:t>
+      </w:r>
+      <w:proofErr w:type="spellEnd"/>
+      <w:r>
+        <w:rPr>
+          <w:rFonts w:ascii="Helvetica" w:hAnsi="Helvetica" w:cs="Helvetica"/>
+          <w:sz w:val="21"/>
+        </w:rPr>
+        <w:t xml:space="preserve">, and </w:t>
+      </w:r>
+      <w:proofErr w:type="spellStart"/>
+      <w:r>
+        <w:rPr>
+          <w:rFonts w:ascii="Helvetica" w:hAnsi="Helvetica" w:cs="Helvetica"/>
+          <w:sz w:val="21"/>
+        </w:rPr>
+        <w:t>Wallact</w:t>
+      </w:r>
+      <w:proofErr w:type="spellEnd"/>
+      <w:r>
+        <w:rPr>
+          <w:rFonts w:ascii="Helvetica" w:hAnsi="Helvetica" w:cs="Helvetica"/>
+          <w:sz w:val="21"/>
+        </w:rPr>
+        <w:t>.</w:t>
       </w:r>
     </w:p>
     <w:p/>
@@ -1127,23 +1419,50 @@
       </w:r>
     </w:p>
     <w:p>
-      <w:r>
-        <w:rPr>
-          <w:rFonts w:ascii="Helvetica" w:hAnsi="Helvetica" w:cs="Helvetica"/>
-          <w:b/>
-          <w:sz w:val="21"/>
-        </w:rPr>
-        <w:t>M.Tech in Computational Mathematics</w:t>
-      </w:r>
-      <w:r>
-        <w:rPr>
-          <w:rFonts w:ascii="Helvetica" w:hAnsi="Helvetica" w:cs="Helvetica"/>
-          <w:sz w:val="21"/>
-        </w:rPr>
-        <w:t xml:space="preserve"> | NIT Surathkal, Karnataka | Jul 2016 - Jun 2018</w:t>
-      </w:r>
-    </w:p>
-    <w:p>
+      <w:proofErr w:type="spellStart"/>
+      <w:r>
+        <w:rPr>
+          <w:rFonts w:ascii="Helvetica" w:hAnsi="Helvetica" w:cs="Helvetica"/>
+          <w:b/>
+          <w:sz w:val="21"/>
+        </w:rPr>
+        <w:t>M.Tech</w:t>
+      </w:r>
+      <w:proofErr w:type="spellEnd"/>
+      <w:r>
+        <w:rPr>
+          <w:rFonts w:ascii="Helvetica" w:hAnsi="Helvetica" w:cs="Helvetica"/>
+          <w:b/>
+          <w:sz w:val="21"/>
+        </w:rPr>
+        <w:t xml:space="preserve"> in Computational Mathematics</w:t>
+      </w:r>
+      <w:r>
+        <w:rPr>
+          <w:rFonts w:ascii="Helvetica" w:hAnsi="Helvetica" w:cs="Helvetica"/>
+          <w:sz w:val="21"/>
+        </w:rPr>
+        <w:t xml:space="preserve"> | NIT </w:t>
+      </w:r>
+      <w:proofErr w:type="spellStart"/>
+      <w:r>
+        <w:rPr>
+          <w:rFonts w:ascii="Helvetica" w:hAnsi="Helvetica" w:cs="Helvetica"/>
+          <w:sz w:val="21"/>
+        </w:rPr>
+        <w:t>Surathkal</w:t>
+      </w:r>
+      <w:proofErr w:type="spellEnd"/>
+      <w:r>
+        <w:rPr>
+          <w:rFonts w:ascii="Helvetica" w:hAnsi="Helvetica" w:cs="Helvetica"/>
+          <w:sz w:val="21"/>
+        </w:rPr>
+        <w:t>, Karnataka | Jul 2016 - Jun 2018</w:t>
+      </w:r>
+    </w:p>
+    <w:p>
+      <w:proofErr w:type="spellStart"/>
       <w:r>
         <w:rPr>
           <w:rFonts w:ascii="Helvetica" w:hAnsi="Helvetica" w:cs="Helvetica"/>
@@ -1152,6 +1471,7 @@
         </w:rPr>
         <w:t>B.Tech</w:t>
       </w:r>
+      <w:proofErr w:type="spellEnd"/>
       <w:r>
         <w:rPr>
           <w:rFonts w:ascii="Helvetica" w:hAnsi="Helvetica" w:cs="Helvetica"/>
@@ -1194,7 +1514,6 @@
           <w:rFonts w:ascii="Helvetica" w:hAnsi="Helvetica" w:cs="Helvetica"/>
           <w:sz w:val="21"/>
         </w:rPr>
-        <w:lastRenderedPageBreak/>
         <w:t>•</w:t>
       </w:r>
       <w:r>
@@ -1619,7 +1938,6 @@
   <w:style w:type="character" w:default="1" w:styleId="DefaultParagraphFont">
     <w:name w:val="Default Paragraph Font"/>
     <w:uiPriority w:val="1"/>
-    <w:semiHidden/>
     <w:unhideWhenUsed/>
   </w:style>
   <w:style w:type="table" w:default="1" w:styleId="TableNormal">
@@ -1665,6 +1983,17 @@
       <w:color w:val="605E5C"/>
       <w:shd w:val="clear" w:color="auto" w:fill="E1DFDD"/>
     </w:rPr>
+  </w:style>
+  <w:style w:type="paragraph" w:styleId="ListParagraph">
+    <w:name w:val="List Paragraph"/>
+    <w:basedOn w:val="Normal"/>
+    <w:uiPriority w:val="34"/>
+    <w:qFormat/>
+    <w:rsid w:val="00C3153B"/>
+    <w:pPr>
+      <w:ind w:left="720"/>
+      <w:contextualSpacing/>
+    </w:pPr>
   </w:style>
 </w:styles>
 </file>

</xml_diff>